<commit_message>
Implemented Feb 19 2026 feedback
</commit_message>
<xml_diff>
--- a/docassemble/ReturnCarProperty/data/templates/request_property_car_fin_letter.docx
+++ b/docassemble/ReturnCarProperty/data/templates/request_property_car_fin_letter.docx
@@ -107,7 +107,15 @@
                 <w:sz w:val="24"/>
                 <w:szCs w:val="24"/>
               </w:rPr>
-              <w:t>name_full</w:t>
+              <w:t>name_</w:t>
+            </w:r>
+            <w:proofErr w:type="gramStart"/>
+            <w:r>
+              <w:rPr>
+                <w:sz w:val="24"/>
+                <w:szCs w:val="24"/>
+              </w:rPr>
+              <w:t>full</w:t>
             </w:r>
             <w:proofErr w:type="spellEnd"/>
             <w:r>
@@ -115,115 +123,170 @@
                 <w:sz w:val="24"/>
                 <w:szCs w:val="24"/>
               </w:rPr>
+              <w:t>(</w:t>
+            </w:r>
+            <w:proofErr w:type="gramEnd"/>
+            <w:r>
+              <w:rPr>
+                <w:sz w:val="24"/>
+                <w:szCs w:val="24"/>
+              </w:rPr>
+              <w:t>)}}</w:t>
+            </w:r>
+            <w:r>
+              <w:rPr>
+                <w:sz w:val="24"/>
+                <w:szCs w:val="24"/>
+              </w:rPr>
+              <w:br/>
+            </w:r>
+            <w:r>
+              <w:rPr>
+                <w:sz w:val="24"/>
+                <w:szCs w:val="24"/>
+              </w:rPr>
+              <w:t xml:space="preserve">{% if </w:t>
+            </w:r>
+            <w:proofErr w:type="spellStart"/>
+            <w:r>
+              <w:rPr>
+                <w:sz w:val="24"/>
+                <w:szCs w:val="24"/>
+              </w:rPr>
+              <w:t>account_number</w:t>
+            </w:r>
+            <w:proofErr w:type="spellEnd"/>
+            <w:r>
+              <w:rPr>
+                <w:sz w:val="24"/>
+                <w:szCs w:val="24"/>
+              </w:rPr>
+              <w:t xml:space="preserve"> != “” %}</w:t>
+            </w:r>
+            <w:r>
+              <w:rPr>
+                <w:sz w:val="24"/>
+                <w:szCs w:val="24"/>
+              </w:rPr>
+              <w:t>A</w:t>
+            </w:r>
+            <w:r>
+              <w:rPr>
+                <w:sz w:val="24"/>
+                <w:szCs w:val="24"/>
+              </w:rPr>
+              <w:t>ccount number</w:t>
+            </w:r>
+            <w:r>
+              <w:rPr>
+                <w:sz w:val="24"/>
+                <w:szCs w:val="24"/>
+              </w:rPr>
+              <w:t>:</w:t>
+            </w:r>
+            <w:r>
+              <w:rPr>
+                <w:sz w:val="24"/>
+                <w:szCs w:val="24"/>
+              </w:rPr>
+              <w:t xml:space="preserve"> {{</w:t>
+            </w:r>
+            <w:proofErr w:type="spellStart"/>
+            <w:r>
+              <w:rPr>
+                <w:sz w:val="24"/>
+                <w:szCs w:val="24"/>
+              </w:rPr>
+              <w:t>account_number</w:t>
+            </w:r>
+            <w:proofErr w:type="spellEnd"/>
+            <w:r>
+              <w:rPr>
+                <w:sz w:val="24"/>
+                <w:szCs w:val="24"/>
+              </w:rPr>
+              <w:t>}}</w:t>
+            </w:r>
+            <w:r>
+              <w:rPr>
+                <w:sz w:val="24"/>
+                <w:szCs w:val="24"/>
+              </w:rPr>
+              <w:br/>
+            </w:r>
+            <w:r>
+              <w:rPr>
+                <w:sz w:val="24"/>
+                <w:szCs w:val="24"/>
+              </w:rPr>
+              <w:t xml:space="preserve">{% endif </w:t>
+            </w:r>
+            <w:r>
+              <w:rPr>
+                <w:sz w:val="24"/>
+                <w:szCs w:val="24"/>
+              </w:rPr>
+              <w:t>%}</w:t>
+            </w:r>
+            <w:r>
+              <w:rPr>
+                <w:sz w:val="24"/>
+                <w:szCs w:val="24"/>
+              </w:rPr>
+              <w:t>{{users</w:t>
+            </w:r>
+            <w:r>
+              <w:rPr>
+                <w:sz w:val="24"/>
+                <w:szCs w:val="24"/>
+              </w:rPr>
+              <w:t>[0].</w:t>
+            </w:r>
+            <w:proofErr w:type="spellStart"/>
+            <w:r>
+              <w:rPr>
+                <w:sz w:val="24"/>
+                <w:szCs w:val="24"/>
+              </w:rPr>
+              <w:t>address.line_one</w:t>
+            </w:r>
+            <w:proofErr w:type="spellEnd"/>
+            <w:r>
+              <w:rPr>
+                <w:sz w:val="24"/>
+                <w:szCs w:val="24"/>
+              </w:rPr>
+              <w:t>(bare=True)}}</w:t>
+            </w:r>
+            <w:r>
+              <w:rPr>
+                <w:sz w:val="24"/>
+                <w:szCs w:val="24"/>
+              </w:rPr>
+              <w:br/>
+            </w:r>
+            <w:r>
+              <w:rPr>
+                <w:sz w:val="24"/>
+                <w:szCs w:val="24"/>
+              </w:rPr>
+              <w:t>{{users[0].</w:t>
+            </w:r>
+            <w:proofErr w:type="spellStart"/>
+            <w:r>
+              <w:rPr>
+                <w:sz w:val="24"/>
+                <w:szCs w:val="24"/>
+              </w:rPr>
+              <w:t>address.line_two</w:t>
+            </w:r>
+            <w:proofErr w:type="spellEnd"/>
+            <w:r>
+              <w:rPr>
+                <w:sz w:val="24"/>
+                <w:szCs w:val="24"/>
+              </w:rPr>
               <w:t>()}}</w:t>
-            </w:r>
-            <w:r>
-              <w:rPr>
-                <w:sz w:val="24"/>
-                <w:szCs w:val="24"/>
-              </w:rPr>
-              <w:br/>
-            </w:r>
-            <w:r>
-              <w:rPr>
-                <w:sz w:val="24"/>
-                <w:szCs w:val="24"/>
-              </w:rPr>
-              <w:t>{{users[0</w:t>
-            </w:r>
-            <w:proofErr w:type="gramStart"/>
-            <w:r>
-              <w:rPr>
-                <w:sz w:val="24"/>
-                <w:szCs w:val="24"/>
-              </w:rPr>
-              <w:t>].</w:t>
-            </w:r>
-            <w:proofErr w:type="spellStart"/>
-            <w:r>
-              <w:rPr>
-                <w:sz w:val="24"/>
-                <w:szCs w:val="24"/>
-              </w:rPr>
-              <w:t>address</w:t>
-            </w:r>
-            <w:proofErr w:type="gramEnd"/>
-            <w:r>
-              <w:rPr>
-                <w:sz w:val="24"/>
-                <w:szCs w:val="24"/>
-              </w:rPr>
-              <w:t>.line_one</w:t>
-            </w:r>
-            <w:proofErr w:type="spellEnd"/>
-            <w:r>
-              <w:rPr>
-                <w:sz w:val="24"/>
-                <w:szCs w:val="24"/>
-              </w:rPr>
-              <w:t>(bare=True)}}</w:t>
-            </w:r>
-            <w:r>
-              <w:rPr>
-                <w:sz w:val="24"/>
-                <w:szCs w:val="24"/>
-              </w:rPr>
-              <w:br/>
-            </w:r>
-            <w:r>
-              <w:rPr>
-                <w:sz w:val="24"/>
-                <w:szCs w:val="24"/>
-              </w:rPr>
-              <w:t>{{users[0</w:t>
-            </w:r>
-            <w:proofErr w:type="gramStart"/>
-            <w:r>
-              <w:rPr>
-                <w:sz w:val="24"/>
-                <w:szCs w:val="24"/>
-              </w:rPr>
-              <w:t>].</w:t>
-            </w:r>
-            <w:proofErr w:type="spellStart"/>
-            <w:r>
-              <w:rPr>
-                <w:sz w:val="24"/>
-                <w:szCs w:val="24"/>
-              </w:rPr>
-              <w:t>address</w:t>
-            </w:r>
-            <w:proofErr w:type="gramEnd"/>
-            <w:r>
-              <w:rPr>
-                <w:sz w:val="24"/>
-                <w:szCs w:val="24"/>
-              </w:rPr>
-              <w:t>.line_</w:t>
-            </w:r>
-            <w:proofErr w:type="gramStart"/>
-            <w:r>
-              <w:rPr>
-                <w:sz w:val="24"/>
-                <w:szCs w:val="24"/>
-              </w:rPr>
-              <w:t>two</w:t>
-            </w:r>
-            <w:proofErr w:type="spellEnd"/>
-            <w:r>
-              <w:rPr>
-                <w:sz w:val="24"/>
-                <w:szCs w:val="24"/>
-              </w:rPr>
-              <w:t>(</w:t>
-            </w:r>
-            <w:proofErr w:type="gramEnd"/>
-            <w:r>
-              <w:rPr>
-                <w:sz w:val="24"/>
-                <w:szCs w:val="24"/>
-              </w:rPr>
-              <w:t>)}}</w:t>
             </w:r>
           </w:p>
         </w:tc>
@@ -239,10 +302,7 @@
       <w:proofErr w:type="spellStart"/>
       <w:proofErr w:type="gramStart"/>
       <w:r>
-        <w:t>fin_</w:t>
-      </w:r>
-      <w:r>
-        <w:t>company.name.first</w:t>
+        <w:t>fin_company.name.first</w:t>
       </w:r>
       <w:proofErr w:type="spellEnd"/>
       <w:proofErr w:type="gramEnd"/>
@@ -322,10 +382,7 @@
       <w:proofErr w:type="spellStart"/>
       <w:proofErr w:type="gramStart"/>
       <w:r>
-        <w:t>fin_</w:t>
-      </w:r>
-      <w:r>
-        <w:t>company.name.first</w:t>
+        <w:t>fin_company.name.first</w:t>
       </w:r>
       <w:proofErr w:type="spellEnd"/>
       <w:proofErr w:type="gramEnd"/>
@@ -413,10 +470,7 @@
         <w:t>.</w:t>
       </w:r>
       <w:r>
-        <w:t xml:space="preserve"> </w:t>
-      </w:r>
-      <w:r>
-        <w:t>I have not received a notice of repossession from the company that repossessed the car</w:t>
+        <w:t xml:space="preserve"> I have not received a notice of repossession from the company that repossessed the car</w:t>
       </w:r>
       <w:r>
         <w:t xml:space="preserve">. </w:t>
@@ -621,42 +675,41 @@
         <w:rPr>
           <w:color w:val="000000"/>
         </w:rPr>
-        <w:t xml:space="preserve"> mailing address can be found above, and additional contact information can be found below my </w:t>
-      </w:r>
-      <w:proofErr w:type="gramStart"/>
-      <w:r>
-        <w:rPr>
-          <w:color w:val="000000"/>
-        </w:rPr>
-        <w:t>signature.{</w:t>
-      </w:r>
-      <w:proofErr w:type="gramEnd"/>
-      <w:r>
-        <w:rPr>
-          <w:color w:val="000000"/>
-        </w:rPr>
-        <w:t xml:space="preserve">% </w:t>
-      </w:r>
-      <w:proofErr w:type="gramStart"/>
-      <w:r>
-        <w:rPr>
-          <w:color w:val="000000"/>
-        </w:rPr>
-        <w:t>endif %}</w:t>
-      </w:r>
-      <w:proofErr w:type="gramEnd"/>
-    </w:p>
-    <w:p>
-      <w:pPr>
-        <w:pStyle w:val="NormalWeb"/>
-        <w:keepNext/>
-        <w:spacing w:before="300" w:beforeAutospacing="0" w:after="160" w:afterAutospacing="0"/>
-      </w:pPr>
-      <w:r>
-        <w:rPr>
-          <w:color w:val="000000"/>
-        </w:rPr>
-        <w:t>Thank you for your immediate attention to this matter.</w:t>
+        <w:t xml:space="preserve"> mailing address can be found above, and additional contact information can be found below my signature.{% endif %}</w:t>
+      </w:r>
+      <w:r>
+        <w:t xml:space="preserve">{% if </w:t>
+      </w:r>
+      <w:proofErr w:type="spellStart"/>
+      <w:r>
+        <w:t>account_number</w:t>
+      </w:r>
+      <w:proofErr w:type="spellEnd"/>
+      <w:r>
+        <w:t xml:space="preserve"> != “” %} </w:t>
+      </w:r>
+      <w:r>
+        <w:t>My account number is</w:t>
+      </w:r>
+      <w:r>
+        <w:t xml:space="preserve"> </w:t>
+      </w:r>
+      <w:r>
+        <w:t>{{</w:t>
+      </w:r>
+      <w:proofErr w:type="spellStart"/>
+      <w:r>
+        <w:t>account_number</w:t>
+      </w:r>
+      <w:proofErr w:type="spellEnd"/>
+      <w:r>
+        <w:t>}}</w:t>
+      </w:r>
+      <w:r>
+        <w:t>.</w:t>
+      </w:r>
+      <w:r>
+        <w:t>{% endif %}</w:t>
       </w:r>
     </w:p>
     <w:p>

</xml_diff>

<commit_message>
Implemented Feb 23 2026 feedback
</commit_message>
<xml_diff>
--- a/docassemble/ReturnCarProperty/data/templates/request_property_car_fin_letter.docx
+++ b/docassemble/ReturnCarProperty/data/templates/request_property_car_fin_letter.docx
@@ -68,23 +68,7 @@
                 <w:sz w:val="24"/>
                 <w:szCs w:val="24"/>
               </w:rPr>
-              <w:t>{{</w:t>
-            </w:r>
-            <w:proofErr w:type="spellStart"/>
-            <w:r>
-              <w:rPr>
-                <w:sz w:val="24"/>
-                <w:szCs w:val="24"/>
-              </w:rPr>
-              <w:t>letter_date</w:t>
-            </w:r>
-            <w:proofErr w:type="spellEnd"/>
-            <w:r>
-              <w:rPr>
-                <w:sz w:val="24"/>
-                <w:szCs w:val="24"/>
-              </w:rPr>
-              <w:t>}}</w:t>
+              <w:t>{{letter_date}}</w:t>
             </w:r>
             <w:r>
               <w:rPr>
@@ -99,39 +83,7 @@
                 <w:szCs w:val="24"/>
               </w:rPr>
               <w:br/>
-              <w:t>{{users[0].</w:t>
-            </w:r>
-            <w:proofErr w:type="spellStart"/>
-            <w:r>
-              <w:rPr>
-                <w:sz w:val="24"/>
-                <w:szCs w:val="24"/>
-              </w:rPr>
-              <w:t>name_</w:t>
-            </w:r>
-            <w:proofErr w:type="gramStart"/>
-            <w:r>
-              <w:rPr>
-                <w:sz w:val="24"/>
-                <w:szCs w:val="24"/>
-              </w:rPr>
-              <w:t>full</w:t>
-            </w:r>
-            <w:proofErr w:type="spellEnd"/>
-            <w:r>
-              <w:rPr>
-                <w:sz w:val="24"/>
-                <w:szCs w:val="24"/>
-              </w:rPr>
-              <w:t>(</w:t>
-            </w:r>
-            <w:proofErr w:type="gramEnd"/>
-            <w:r>
-              <w:rPr>
-                <w:sz w:val="24"/>
-                <w:szCs w:val="24"/>
-              </w:rPr>
-              <w:t>)}}</w:t>
+              <w:t>{{users[0].name_full()}}</w:t>
             </w:r>
             <w:r>
               <w:rPr>
@@ -145,67 +97,21 @@
                 <w:sz w:val="24"/>
                 <w:szCs w:val="24"/>
               </w:rPr>
-              <w:t xml:space="preserve">{% if </w:t>
-            </w:r>
-            <w:proofErr w:type="spellStart"/>
-            <w:r>
-              <w:rPr>
-                <w:sz w:val="24"/>
-                <w:szCs w:val="24"/>
-              </w:rPr>
-              <w:t>account_number</w:t>
-            </w:r>
-            <w:proofErr w:type="spellEnd"/>
-            <w:r>
-              <w:rPr>
-                <w:sz w:val="24"/>
-                <w:szCs w:val="24"/>
-              </w:rPr>
-              <w:t xml:space="preserve"> != “” %}</w:t>
+              <w:t>Account number: {{</w:t>
             </w:r>
             <w:r>
               <w:rPr>
                 <w:sz w:val="24"/>
                 <w:szCs w:val="24"/>
               </w:rPr>
-              <w:t>A</w:t>
+              <w:t>fin_company.</w:t>
             </w:r>
             <w:r>
               <w:rPr>
                 <w:sz w:val="24"/>
                 <w:szCs w:val="24"/>
               </w:rPr>
-              <w:t>ccount number</w:t>
-            </w:r>
-            <w:r>
-              <w:rPr>
-                <w:sz w:val="24"/>
-                <w:szCs w:val="24"/>
-              </w:rPr>
-              <w:t>:</w:t>
-            </w:r>
-            <w:r>
-              <w:rPr>
-                <w:sz w:val="24"/>
-                <w:szCs w:val="24"/>
-              </w:rPr>
-              <w:t xml:space="preserve"> {{</w:t>
-            </w:r>
-            <w:proofErr w:type="spellStart"/>
-            <w:r>
-              <w:rPr>
-                <w:sz w:val="24"/>
-                <w:szCs w:val="24"/>
-              </w:rPr>
-              <w:t>account_number</w:t>
-            </w:r>
-            <w:proofErr w:type="spellEnd"/>
-            <w:r>
-              <w:rPr>
-                <w:sz w:val="24"/>
-                <w:szCs w:val="24"/>
-              </w:rPr>
-              <w:t>}}</w:t>
+              <w:t>account_number}}</w:t>
             </w:r>
             <w:r>
               <w:rPr>
@@ -219,20 +125,6 @@
                 <w:sz w:val="24"/>
                 <w:szCs w:val="24"/>
               </w:rPr>
-              <w:t xml:space="preserve">{% endif </w:t>
-            </w:r>
-            <w:r>
-              <w:rPr>
-                <w:sz w:val="24"/>
-                <w:szCs w:val="24"/>
-              </w:rPr>
-              <w:t>%}</w:t>
-            </w:r>
-            <w:r>
-              <w:rPr>
-                <w:sz w:val="24"/>
-                <w:szCs w:val="24"/>
-              </w:rPr>
               <w:t>{{users</w:t>
             </w:r>
             <w:r>
@@ -240,23 +132,7 @@
                 <w:sz w:val="24"/>
                 <w:szCs w:val="24"/>
               </w:rPr>
-              <w:t>[0].</w:t>
-            </w:r>
-            <w:proofErr w:type="spellStart"/>
-            <w:r>
-              <w:rPr>
-                <w:sz w:val="24"/>
-                <w:szCs w:val="24"/>
-              </w:rPr>
-              <w:t>address.line_one</w:t>
-            </w:r>
-            <w:proofErr w:type="spellEnd"/>
-            <w:r>
-              <w:rPr>
-                <w:sz w:val="24"/>
-                <w:szCs w:val="24"/>
-              </w:rPr>
-              <w:t>(bare=True)}}</w:t>
+              <w:t>[0].address.line_one(bare=True)}}</w:t>
             </w:r>
             <w:r>
               <w:rPr>
@@ -270,23 +146,7 @@
                 <w:sz w:val="24"/>
                 <w:szCs w:val="24"/>
               </w:rPr>
-              <w:t>{{users[0].</w:t>
-            </w:r>
-            <w:proofErr w:type="spellStart"/>
-            <w:r>
-              <w:rPr>
-                <w:sz w:val="24"/>
-                <w:szCs w:val="24"/>
-              </w:rPr>
-              <w:t>address.line_two</w:t>
-            </w:r>
-            <w:proofErr w:type="spellEnd"/>
-            <w:r>
-              <w:rPr>
-                <w:sz w:val="24"/>
-                <w:szCs w:val="24"/>
-              </w:rPr>
-              <w:t>()}}</w:t>
+              <w:t>{{users[0].address.line_two()}}</w:t>
             </w:r>
           </w:p>
         </w:tc>
@@ -297,65 +157,15 @@
         <w:pStyle w:val="NormalWeb"/>
       </w:pPr>
       <w:r>
-        <w:t>{{</w:t>
-      </w:r>
-      <w:proofErr w:type="spellStart"/>
-      <w:proofErr w:type="gramStart"/>
-      <w:r>
-        <w:t>fin_company.name.first</w:t>
-      </w:r>
-      <w:proofErr w:type="spellEnd"/>
-      <w:proofErr w:type="gramEnd"/>
-      <w:r>
-        <w:t>}}</w:t>
+        <w:t>{{fin_company.name.first}}</w:t>
       </w:r>
       <w:r>
         <w:br/>
-        <w:t>{{</w:t>
-      </w:r>
-      <w:proofErr w:type="spellStart"/>
-      <w:r>
-        <w:t>fin_</w:t>
-      </w:r>
-      <w:proofErr w:type="gramStart"/>
-      <w:r>
-        <w:t>company.address</w:t>
-      </w:r>
-      <w:proofErr w:type="gramEnd"/>
-      <w:r>
-        <w:t>.line_one</w:t>
-      </w:r>
-      <w:proofErr w:type="spellEnd"/>
-      <w:r>
-        <w:t>(bare=True)}}</w:t>
+        <w:t>{{fin_company.address.line_one(bare=True)}}</w:t>
       </w:r>
       <w:r>
         <w:br/>
-        <w:t>{{</w:t>
-      </w:r>
-      <w:proofErr w:type="spellStart"/>
-      <w:r>
-        <w:t>fin_</w:t>
-      </w:r>
-      <w:proofErr w:type="gramStart"/>
-      <w:r>
-        <w:t>company.address</w:t>
-      </w:r>
-      <w:proofErr w:type="gramEnd"/>
-      <w:r>
-        <w:t>.line_</w:t>
-      </w:r>
-      <w:proofErr w:type="gramStart"/>
-      <w:r>
-        <w:t>two</w:t>
-      </w:r>
-      <w:proofErr w:type="spellEnd"/>
-      <w:r>
-        <w:t>(</w:t>
-      </w:r>
-      <w:proofErr w:type="gramEnd"/>
-      <w:r>
-        <w:t>)}}</w:t>
+        <w:t>{{fin_company.address.line_two()}}</w:t>
       </w:r>
     </w:p>
     <w:p>
@@ -366,10 +176,25 @@
         <w:t xml:space="preserve">Re: </w:t>
       </w:r>
       <w:r>
-        <w:t xml:space="preserve">Request for Inventory of Personal Property under the Illinois Collateral Recovery </w:t>
-      </w:r>
-      <w:r>
-        <w:t>Act</w:t>
+        <w:t xml:space="preserve">Request for </w:t>
+      </w:r>
+      <w:r>
+        <w:t>r</w:t>
+      </w:r>
+      <w:r>
+        <w:t xml:space="preserve">epossession </w:t>
+      </w:r>
+      <w:r>
+        <w:t>c</w:t>
+      </w:r>
+      <w:r>
+        <w:t xml:space="preserve">ompany </w:t>
+      </w:r>
+      <w:r>
+        <w:t>i</w:t>
+      </w:r>
+      <w:r>
+        <w:t>nformation</w:t>
       </w:r>
     </w:p>
     <w:p>
@@ -377,17 +202,7 @@
         <w:pStyle w:val="NormalWeb"/>
       </w:pPr>
       <w:r>
-        <w:t>Dear {{</w:t>
-      </w:r>
-      <w:proofErr w:type="spellStart"/>
-      <w:proofErr w:type="gramStart"/>
-      <w:r>
-        <w:t>fin_company.name.first</w:t>
-      </w:r>
-      <w:proofErr w:type="spellEnd"/>
-      <w:proofErr w:type="gramEnd"/>
-      <w:r>
-        <w:t>}}:</w:t>
+        <w:t>Dear {{fin_company.name.first}}:</w:t>
       </w:r>
     </w:p>
     <w:p>
@@ -407,31 +222,7 @@
         <w:t xml:space="preserve">, </w:t>
       </w:r>
       <w:r>
-        <w:t>a {{</w:t>
-      </w:r>
-      <w:proofErr w:type="spellStart"/>
-      <w:r>
-        <w:t>car_year</w:t>
-      </w:r>
-      <w:proofErr w:type="spellEnd"/>
-      <w:r>
-        <w:t>}} {{</w:t>
-      </w:r>
-      <w:proofErr w:type="spellStart"/>
-      <w:r>
-        <w:t>car_make</w:t>
-      </w:r>
-      <w:proofErr w:type="spellEnd"/>
-      <w:r>
-        <w:t>}} {{</w:t>
-      </w:r>
-      <w:proofErr w:type="spellStart"/>
-      <w:r>
-        <w:t>car_model</w:t>
-      </w:r>
-      <w:proofErr w:type="spellEnd"/>
-      <w:r>
-        <w:t>}}.</w:t>
+        <w:t>a {{car_year}} {{car_make}} {{car_model}}.</w:t>
       </w:r>
       <w:r>
         <w:t xml:space="preserve"> </w:t>
@@ -440,37 +231,16 @@
         <w:t xml:space="preserve">It was repossessed on or </w:t>
       </w:r>
       <w:r>
-        <w:t>about {{</w:t>
-      </w:r>
-      <w:proofErr w:type="spellStart"/>
-      <w:r>
-        <w:t>repo_</w:t>
-      </w:r>
-      <w:proofErr w:type="gramStart"/>
-      <w:r>
-        <w:t>date</w:t>
-      </w:r>
-      <w:proofErr w:type="spellEnd"/>
-      <w:r>
-        <w:t>}}.</w:t>
-      </w:r>
-      <w:proofErr w:type="gramEnd"/>
-      <w:r>
-        <w:t xml:space="preserve"> The car contained {{</w:t>
-      </w:r>
-      <w:proofErr w:type="spellStart"/>
-      <w:r>
-        <w:t>comma_and_list</w:t>
-      </w:r>
-      <w:proofErr w:type="spellEnd"/>
-      <w:r>
-        <w:t>(items)}}</w:t>
+        <w:t>about {{repo_date}}. The car contained {{comma_and_list(items)}}</w:t>
       </w:r>
       <w:r>
         <w:t>.</w:t>
       </w:r>
       <w:r>
-        <w:t xml:space="preserve"> I have not received a notice of repossession from the company that repossessed the car</w:t>
+        <w:t xml:space="preserve"> </w:t>
+      </w:r>
+      <w:r>
+        <w:t>I have not received a notice of repossession from the company that repossessed the car</w:t>
       </w:r>
       <w:r>
         <w:t xml:space="preserve">. </w:t>
@@ -483,6 +253,15 @@
       </w:r>
       <w:r>
         <w:t>.</w:t>
+      </w:r>
+      <w:r>
+        <w:t xml:space="preserve"> My account number </w:t>
+      </w:r>
+      <w:r>
+        <w:t xml:space="preserve">with {{fin_company.name.first}} </w:t>
+      </w:r>
+      <w:r>
+        <w:t>is {{fin_company.account_number}}.</w:t>
       </w:r>
     </w:p>
     <w:p>
@@ -517,7 +296,7 @@
         <w:rPr>
           <w:color w:val="000000"/>
         </w:rPr>
-        <w:t xml:space="preserve">Your prompt attention to this matter is </w:t>
+        <w:t xml:space="preserve">Your attention to this matter is </w:t>
       </w:r>
       <w:r>
         <w:rPr>
@@ -559,157 +338,25 @@
         <w:rPr>
           <w:color w:val="000000"/>
         </w:rPr>
-        <w:t xml:space="preserve">{% if </w:t>
-      </w:r>
-      <w:proofErr w:type="gramStart"/>
+        <w:t>{% if users[0].phone_number == “” and users[0].email == “” %}</w:t>
+      </w:r>
       <w:r>
         <w:rPr>
           <w:color w:val="000000"/>
         </w:rPr>
-        <w:t>users[</w:t>
-      </w:r>
-      <w:proofErr w:type="gramEnd"/>
+        <w:t>Please address your reply to the mailing address above</w:t>
+      </w:r>
       <w:r>
         <w:rPr>
           <w:color w:val="000000"/>
         </w:rPr>
-        <w:t>0</w:t>
-      </w:r>
-      <w:proofErr w:type="gramStart"/>
+        <w:t>.</w:t>
+      </w:r>
       <w:r>
         <w:rPr>
           <w:color w:val="000000"/>
         </w:rPr>
-        <w:t>].</w:t>
-      </w:r>
-      <w:proofErr w:type="spellStart"/>
-      <w:r>
-        <w:rPr>
-          <w:color w:val="000000"/>
-        </w:rPr>
-        <w:t>phone</w:t>
-      </w:r>
-      <w:proofErr w:type="gramEnd"/>
-      <w:r>
-        <w:rPr>
-          <w:color w:val="000000"/>
-        </w:rPr>
-        <w:t>_number</w:t>
-      </w:r>
-      <w:proofErr w:type="spellEnd"/>
-      <w:r>
-        <w:rPr>
-          <w:color w:val="000000"/>
-        </w:rPr>
-        <w:t xml:space="preserve"> == “” and </w:t>
-      </w:r>
-      <w:proofErr w:type="gramStart"/>
-      <w:r>
-        <w:rPr>
-          <w:color w:val="000000"/>
-        </w:rPr>
-        <w:t>users[</w:t>
-      </w:r>
-      <w:proofErr w:type="gramEnd"/>
-      <w:r>
-        <w:rPr>
-          <w:color w:val="000000"/>
-        </w:rPr>
-        <w:t>0</w:t>
-      </w:r>
-      <w:proofErr w:type="gramStart"/>
-      <w:r>
-        <w:rPr>
-          <w:color w:val="000000"/>
-        </w:rPr>
-        <w:t>].email</w:t>
-      </w:r>
-      <w:proofErr w:type="gramEnd"/>
-      <w:r>
-        <w:rPr>
-          <w:color w:val="000000"/>
-        </w:rPr>
-        <w:t xml:space="preserve"> == “” </w:t>
-      </w:r>
-      <w:proofErr w:type="gramStart"/>
-      <w:r>
-        <w:rPr>
-          <w:color w:val="000000"/>
-        </w:rPr>
-        <w:t>%}</w:t>
-      </w:r>
-      <w:r>
-        <w:rPr>
-          <w:color w:val="000000"/>
-        </w:rPr>
-        <w:t>Please</w:t>
-      </w:r>
-      <w:proofErr w:type="gramEnd"/>
-      <w:r>
-        <w:rPr>
-          <w:color w:val="000000"/>
-        </w:rPr>
-        <w:t xml:space="preserve"> address your reply to the mailing address above</w:t>
-      </w:r>
-      <w:r>
-        <w:rPr>
-          <w:color w:val="000000"/>
-        </w:rPr>
-        <w:t>.</w:t>
-      </w:r>
-      <w:r>
-        <w:rPr>
-          <w:color w:val="000000"/>
-        </w:rPr>
-        <w:t xml:space="preserve"> {% else </w:t>
-      </w:r>
-      <w:proofErr w:type="gramStart"/>
-      <w:r>
-        <w:rPr>
-          <w:color w:val="000000"/>
-        </w:rPr>
-        <w:t>%}My</w:t>
-      </w:r>
-      <w:proofErr w:type="gramEnd"/>
-      <w:r>
-        <w:rPr>
-          <w:color w:val="000000"/>
-        </w:rPr>
-        <w:t xml:space="preserve"> mailing address can be found above, and additional contact information can be found below my signature.{% endif %}</w:t>
-      </w:r>
-      <w:r>
-        <w:t xml:space="preserve">{% if </w:t>
-      </w:r>
-      <w:proofErr w:type="spellStart"/>
-      <w:r>
-        <w:t>account_number</w:t>
-      </w:r>
-      <w:proofErr w:type="spellEnd"/>
-      <w:r>
-        <w:t xml:space="preserve"> != “” %} </w:t>
-      </w:r>
-      <w:r>
-        <w:t>My account number is</w:t>
-      </w:r>
-      <w:r>
-        <w:t xml:space="preserve"> </w:t>
-      </w:r>
-      <w:r>
-        <w:t>{{</w:t>
-      </w:r>
-      <w:proofErr w:type="spellStart"/>
-      <w:r>
-        <w:t>account_number</w:t>
-      </w:r>
-      <w:proofErr w:type="spellEnd"/>
-      <w:r>
-        <w:t>}}</w:t>
-      </w:r>
-      <w:r>
-        <w:t>.</w:t>
-      </w:r>
-      <w:r>
-        <w:t>{% endif %}</w:t>
+        <w:t>{% else %}My mailing address can be found above, and additional contact information can be found below my signature.{% endif %}</w:t>
       </w:r>
     </w:p>
     <w:p>
@@ -746,63 +393,7 @@
         </w:rPr>
       </w:pPr>
       <w:r>
-        <w:t>{{users[0].</w:t>
-      </w:r>
-      <w:proofErr w:type="spellStart"/>
-      <w:r>
-        <w:t>name_</w:t>
-      </w:r>
-      <w:proofErr w:type="gramStart"/>
-      <w:r>
-        <w:t>full</w:t>
-      </w:r>
-      <w:proofErr w:type="spellEnd"/>
-      <w:r>
-        <w:t>(</w:t>
-      </w:r>
-      <w:proofErr w:type="gramEnd"/>
-      <w:r>
-        <w:t>)</w:t>
-      </w:r>
-      <w:proofErr w:type="gramStart"/>
-      <w:r>
-        <w:t>}}{</w:t>
-      </w:r>
-      <w:proofErr w:type="gramEnd"/>
-      <w:r>
-        <w:t xml:space="preserve">% if </w:t>
-      </w:r>
-      <w:proofErr w:type="gramStart"/>
-      <w:r>
-        <w:t>users[</w:t>
-      </w:r>
-      <w:proofErr w:type="gramEnd"/>
-      <w:r>
-        <w:t>0</w:t>
-      </w:r>
-      <w:proofErr w:type="gramStart"/>
-      <w:r>
-        <w:t>].</w:t>
-      </w:r>
-      <w:proofErr w:type="spellStart"/>
-      <w:r>
-        <w:t>phone</w:t>
-      </w:r>
-      <w:proofErr w:type="gramEnd"/>
-      <w:r>
-        <w:t>_</w:t>
-      </w:r>
-      <w:proofErr w:type="gramStart"/>
-      <w:r>
-        <w:t>number</w:t>
-      </w:r>
-      <w:proofErr w:type="spellEnd"/>
-      <w:r>
-        <w:t xml:space="preserve"> !</w:t>
-      </w:r>
-      <w:proofErr w:type="gramEnd"/>
-      <w:r>
-        <w:t>= “” %}</w:t>
+        <w:t>{{users[0].name_full()}}{% if users[0].phone_number != “” %}</w:t>
       </w:r>
       <w:r>
         <w:rPr>
@@ -815,87 +406,10 @@
         <w:rPr>
           <w:color w:val="000000"/>
         </w:rPr>
-        <w:t>{{</w:t>
-      </w:r>
-      <w:proofErr w:type="spellStart"/>
-      <w:r>
-        <w:rPr>
-          <w:color w:val="000000"/>
-        </w:rPr>
-        <w:t>phone_number_formatted</w:t>
-      </w:r>
-      <w:proofErr w:type="spellEnd"/>
-      <w:r>
-        <w:rPr>
-          <w:color w:val="000000"/>
-        </w:rPr>
-        <w:t>(users[0</w:t>
-      </w:r>
-      <w:proofErr w:type="gramStart"/>
-      <w:r>
-        <w:rPr>
-          <w:color w:val="000000"/>
-        </w:rPr>
-        <w:t>].</w:t>
-      </w:r>
-      <w:proofErr w:type="spellStart"/>
-      <w:r>
-        <w:rPr>
-          <w:color w:val="000000"/>
-        </w:rPr>
-        <w:t>phone</w:t>
-      </w:r>
-      <w:proofErr w:type="gramEnd"/>
-      <w:r>
-        <w:rPr>
-          <w:color w:val="000000"/>
-        </w:rPr>
-        <w:t>_number</w:t>
-      </w:r>
-      <w:proofErr w:type="spellEnd"/>
-      <w:r>
-        <w:rPr>
-          <w:color w:val="000000"/>
-        </w:rPr>
-        <w:t>)</w:t>
-      </w:r>
-      <w:proofErr w:type="gramStart"/>
-      <w:r>
-        <w:rPr>
-          <w:color w:val="000000"/>
-        </w:rPr>
-        <w:t>}}</w:t>
-      </w:r>
-      <w:r>
-        <w:t>{</w:t>
-      </w:r>
-      <w:proofErr w:type="gramEnd"/>
-      <w:r>
-        <w:t xml:space="preserve">% endif </w:t>
-      </w:r>
-      <w:proofErr w:type="gramStart"/>
-      <w:r>
-        <w:t>%}{</w:t>
-      </w:r>
-      <w:proofErr w:type="gramEnd"/>
-      <w:r>
-        <w:t xml:space="preserve">% if </w:t>
-      </w:r>
-      <w:proofErr w:type="gramStart"/>
-      <w:r>
-        <w:t>users[</w:t>
-      </w:r>
-      <w:proofErr w:type="gramEnd"/>
-      <w:r>
-        <w:t>0</w:t>
-      </w:r>
-      <w:proofErr w:type="gramStart"/>
-      <w:r>
-        <w:t>].email !=</w:t>
-      </w:r>
-      <w:proofErr w:type="gramEnd"/>
-      <w:r>
-        <w:t xml:space="preserve"> “” %}</w:t>
+        <w:t>{{phone_number_formatted(users[0].phone_number)}}</w:t>
+      </w:r>
+      <w:r>
+        <w:t>{% endif %}{% if users[0].email != “” %}</w:t>
       </w:r>
       <w:r>
         <w:rPr>
@@ -905,15 +419,7 @@
         <w:br/>
       </w:r>
       <w:r>
-        <w:t>{{users[0</w:t>
-      </w:r>
-      <w:proofErr w:type="gramStart"/>
-      <w:r>
-        <w:t>].email}}{</w:t>
-      </w:r>
-      <w:proofErr w:type="gramEnd"/>
-      <w:r>
-        <w:t>% endif %}</w:t>
+        <w:t>{{users[0].email}}{% endif %}</w:t>
       </w:r>
     </w:p>
     <w:p/>

</xml_diff>

<commit_message>
Implemented Mar 3 2026 feedback
</commit_message>
<xml_diff>
--- a/docassemble/ReturnCarProperty/data/templates/request_property_car_fin_letter.docx
+++ b/docassemble/ReturnCarProperty/data/templates/request_property_car_fin_letter.docx
@@ -68,7 +68,23 @@
                 <w:sz w:val="24"/>
                 <w:szCs w:val="24"/>
               </w:rPr>
-              <w:t>{{letter_date}}</w:t>
+              <w:t>{{</w:t>
+            </w:r>
+            <w:proofErr w:type="spellStart"/>
+            <w:r>
+              <w:rPr>
+                <w:sz w:val="24"/>
+                <w:szCs w:val="24"/>
+              </w:rPr>
+              <w:t>letter_date</w:t>
+            </w:r>
+            <w:proofErr w:type="spellEnd"/>
+            <w:r>
+              <w:rPr>
+                <w:sz w:val="24"/>
+                <w:szCs w:val="24"/>
+              </w:rPr>
+              <w:t>}}</w:t>
             </w:r>
             <w:r>
               <w:rPr>
@@ -83,7 +99,15 @@
                 <w:szCs w:val="24"/>
               </w:rPr>
               <w:br/>
-              <w:t>{{users[0].name_</w:t>
+              <w:t>{{users[0].</w:t>
+            </w:r>
+            <w:proofErr w:type="spellStart"/>
+            <w:r>
+              <w:rPr>
+                <w:sz w:val="24"/>
+                <w:szCs w:val="24"/>
+              </w:rPr>
+              <w:t>name_</w:t>
             </w:r>
             <w:proofErr w:type="gramStart"/>
             <w:r>
@@ -91,7 +115,15 @@
                 <w:sz w:val="24"/>
                 <w:szCs w:val="24"/>
               </w:rPr>
-              <w:t>full(</w:t>
+              <w:t>full</w:t>
+            </w:r>
+            <w:proofErr w:type="spellEnd"/>
+            <w:r>
+              <w:rPr>
+                <w:sz w:val="24"/>
+                <w:szCs w:val="24"/>
+              </w:rPr>
+              <w:t>(</w:t>
             </w:r>
             <w:proofErr w:type="gramEnd"/>
             <w:r>
@@ -113,7 +145,15 @@
                 <w:sz w:val="24"/>
                 <w:szCs w:val="24"/>
               </w:rPr>
-              <w:t>{% if fin_</w:t>
+              <w:t xml:space="preserve">{% if </w:t>
+            </w:r>
+            <w:proofErr w:type="spellStart"/>
+            <w:r>
+              <w:rPr>
+                <w:sz w:val="24"/>
+                <w:szCs w:val="24"/>
+              </w:rPr>
+              <w:t>fin_</w:t>
             </w:r>
             <w:proofErr w:type="gramStart"/>
             <w:r>
@@ -137,7 +177,15 @@
                 <w:sz w:val="24"/>
                 <w:szCs w:val="24"/>
               </w:rPr>
-              <w:t>number !</w:t>
+              <w:t>number</w:t>
+            </w:r>
+            <w:proofErr w:type="spellEnd"/>
+            <w:r>
+              <w:rPr>
+                <w:sz w:val="24"/>
+                <w:szCs w:val="24"/>
+              </w:rPr>
+              <w:t xml:space="preserve"> !</w:t>
             </w:r>
             <w:proofErr w:type="gramEnd"/>
             <w:r>
@@ -170,6 +218,7 @@
               </w:rPr>
               <w:t xml:space="preserve"> number: {{</w:t>
             </w:r>
+            <w:proofErr w:type="spellStart"/>
             <w:r>
               <w:rPr>
                 <w:sz w:val="24"/>
@@ -198,7 +247,15 @@
                 <w:sz w:val="24"/>
                 <w:szCs w:val="24"/>
               </w:rPr>
-              <w:t>_number}}</w:t>
+              <w:t>_number</w:t>
+            </w:r>
+            <w:proofErr w:type="spellEnd"/>
+            <w:r>
+              <w:rPr>
+                <w:sz w:val="24"/>
+                <w:szCs w:val="24"/>
+              </w:rPr>
+              <w:t>}}</w:t>
             </w:r>
             <w:r>
               <w:rPr>
@@ -250,7 +307,15 @@
                 <w:sz w:val="24"/>
                 <w:szCs w:val="24"/>
               </w:rPr>
-              <w:t>].address</w:t>
+              <w:t>].</w:t>
+            </w:r>
+            <w:proofErr w:type="spellStart"/>
+            <w:r>
+              <w:rPr>
+                <w:sz w:val="24"/>
+                <w:szCs w:val="24"/>
+              </w:rPr>
+              <w:t>address</w:t>
             </w:r>
             <w:proofErr w:type="gramEnd"/>
             <w:r>
@@ -258,7 +323,15 @@
                 <w:sz w:val="24"/>
                 <w:szCs w:val="24"/>
               </w:rPr>
-              <w:t>.line_one(bare=True)}}</w:t>
+              <w:t>.line_one</w:t>
+            </w:r>
+            <w:proofErr w:type="spellEnd"/>
+            <w:r>
+              <w:rPr>
+                <w:sz w:val="24"/>
+                <w:szCs w:val="24"/>
+              </w:rPr>
+              <w:t>(bare=True)}}</w:t>
             </w:r>
             <w:r>
               <w:rPr>
@@ -280,7 +353,15 @@
                 <w:sz w:val="24"/>
                 <w:szCs w:val="24"/>
               </w:rPr>
-              <w:t>].address</w:t>
+              <w:t>].</w:t>
+            </w:r>
+            <w:proofErr w:type="spellStart"/>
+            <w:r>
+              <w:rPr>
+                <w:sz w:val="24"/>
+                <w:szCs w:val="24"/>
+              </w:rPr>
+              <w:t>address</w:t>
             </w:r>
             <w:proofErr w:type="gramEnd"/>
             <w:r>
@@ -296,7 +377,15 @@
                 <w:sz w:val="24"/>
                 <w:szCs w:val="24"/>
               </w:rPr>
-              <w:t>two(</w:t>
+              <w:t>two</w:t>
+            </w:r>
+            <w:proofErr w:type="spellEnd"/>
+            <w:r>
+              <w:rPr>
+                <w:sz w:val="24"/>
+                <w:szCs w:val="24"/>
+              </w:rPr>
+              <w:t>(</w:t>
             </w:r>
             <w:proofErr w:type="gramEnd"/>
             <w:r>
@@ -317,17 +406,23 @@
       <w:r>
         <w:t>{{</w:t>
       </w:r>
+      <w:proofErr w:type="spellStart"/>
       <w:proofErr w:type="gramStart"/>
       <w:r>
         <w:t>fin_company.name.first</w:t>
       </w:r>
+      <w:proofErr w:type="spellEnd"/>
       <w:proofErr w:type="gramEnd"/>
       <w:r>
         <w:t>}}</w:t>
       </w:r>
       <w:r>
         <w:br/>
-        <w:t>{{fin_</w:t>
+        <w:t>{{</w:t>
+      </w:r>
+      <w:proofErr w:type="spellStart"/>
+      <w:r>
+        <w:t>fin_</w:t>
       </w:r>
       <w:proofErr w:type="gramStart"/>
       <w:r>
@@ -335,11 +430,19 @@
       </w:r>
       <w:proofErr w:type="gramEnd"/>
       <w:r>
-        <w:t>.line_one(bare=True)}}</w:t>
+        <w:t>.line_one</w:t>
+      </w:r>
+      <w:proofErr w:type="spellEnd"/>
+      <w:r>
+        <w:t>(bare=True)}}</w:t>
       </w:r>
       <w:r>
         <w:br/>
-        <w:t>{{fin_</w:t>
+        <w:t>{{</w:t>
+      </w:r>
+      <w:proofErr w:type="spellStart"/>
+      <w:r>
+        <w:t>fin_</w:t>
       </w:r>
       <w:proofErr w:type="gramStart"/>
       <w:r>
@@ -351,7 +454,11 @@
       </w:r>
       <w:proofErr w:type="gramStart"/>
       <w:r>
-        <w:t>two(</w:t>
+        <w:t>two</w:t>
+      </w:r>
+      <w:proofErr w:type="spellEnd"/>
+      <w:r>
+        <w:t>(</w:t>
       </w:r>
       <w:proofErr w:type="gramEnd"/>
       <w:r>
@@ -396,7 +503,11 @@
         <w:br/>
       </w:r>
       <w:r>
-        <w:t>{% if fin_</w:t>
+        <w:t xml:space="preserve">{% if </w:t>
+      </w:r>
+      <w:proofErr w:type="spellStart"/>
+      <w:r>
+        <w:t>fin_</w:t>
       </w:r>
       <w:proofErr w:type="gramStart"/>
       <w:r>
@@ -404,51 +515,39 @@
       </w:r>
       <w:proofErr w:type="gramEnd"/>
       <w:r>
-        <w:t>_</w:t>
-      </w:r>
-      <w:proofErr w:type="gramStart"/>
-      <w:r>
-        <w:t>number !</w:t>
-      </w:r>
-      <w:proofErr w:type="gramEnd"/>
-      <w:r>
-        <w:t xml:space="preserve">= “” </w:t>
-      </w:r>
-      <w:proofErr w:type="gramStart"/>
-      <w:r>
-        <w:t>%}</w:t>
-      </w:r>
-      <w:r>
-        <w:t>A</w:t>
-      </w:r>
-      <w:r>
-        <w:t>ccount</w:t>
-      </w:r>
-      <w:proofErr w:type="gramEnd"/>
-      <w:r>
+        <w:t>_number</w:t>
+      </w:r>
+      <w:proofErr w:type="spellEnd"/>
+      <w:r>
+        <w:t xml:space="preserve"> != “” %}</w:t>
+      </w:r>
+      <w:r>
+        <w:t xml:space="preserve">     </w:t>
+      </w:r>
+      <w:r>
+        <w:rPr>
+          <w:sz w:val="18"/>
+          <w:szCs w:val="18"/>
+        </w:rPr>
         <w:t xml:space="preserve"> </w:t>
       </w:r>
       <w:r>
-        <w:t>#:</w:t>
-      </w:r>
-      <w:r>
-        <w:t xml:space="preserve"> {{fin_</w:t>
-      </w:r>
-      <w:proofErr w:type="gramStart"/>
-      <w:r>
-        <w:t>company.account</w:t>
-      </w:r>
-      <w:proofErr w:type="gramEnd"/>
-      <w:r>
-        <w:t>_number</w:t>
-      </w:r>
-      <w:proofErr w:type="gramStart"/>
-      <w:r>
-        <w:t>}}{</w:t>
-      </w:r>
-      <w:proofErr w:type="gramEnd"/>
-      <w:r>
-        <w:t>% endif %}</w:t>
+        <w:rPr>
+          <w:sz w:val="12"/>
+          <w:szCs w:val="12"/>
+        </w:rPr>
+        <w:t xml:space="preserve"> </w:t>
+      </w:r>
+      <w:r>
+        <w:t>Account #: {{</w:t>
+      </w:r>
+      <w:proofErr w:type="spellStart"/>
+      <w:r>
+        <w:t>fin_company.account_number</w:t>
+      </w:r>
+      <w:proofErr w:type="spellEnd"/>
+      <w:r>
+        <w:t>}}{% endif %}</w:t>
       </w:r>
     </w:p>
     <w:p>
@@ -458,10 +557,12 @@
       <w:r>
         <w:t>Dear {{</w:t>
       </w:r>
+      <w:proofErr w:type="spellStart"/>
       <w:proofErr w:type="gramStart"/>
       <w:r>
         <w:t>fin_company.name.first</w:t>
       </w:r>
+      <w:proofErr w:type="spellEnd"/>
       <w:proofErr w:type="gramEnd"/>
       <w:r>
         <w:t>}}:</w:t>
@@ -484,7 +585,31 @@
         <w:t xml:space="preserve">, </w:t>
       </w:r>
       <w:r>
-        <w:t>a {{car_year}} {{car_make}} {{car_model}}.</w:t>
+        <w:t>a {{</w:t>
+      </w:r>
+      <w:proofErr w:type="spellStart"/>
+      <w:r>
+        <w:t>car_year</w:t>
+      </w:r>
+      <w:proofErr w:type="spellEnd"/>
+      <w:r>
+        <w:t>}} {{</w:t>
+      </w:r>
+      <w:proofErr w:type="spellStart"/>
+      <w:r>
+        <w:t>car_make</w:t>
+      </w:r>
+      <w:proofErr w:type="spellEnd"/>
+      <w:r>
+        <w:t>}} {{</w:t>
+      </w:r>
+      <w:proofErr w:type="spellStart"/>
+      <w:r>
+        <w:t>car_model</w:t>
+      </w:r>
+      <w:proofErr w:type="spellEnd"/>
+      <w:r>
+        <w:t>}}.</w:t>
       </w:r>
       <w:r>
         <w:t xml:space="preserve"> </w:t>
@@ -493,15 +618,31 @@
         <w:t xml:space="preserve">It was repossessed on or </w:t>
       </w:r>
       <w:r>
-        <w:t>about {{repo_</w:t>
-      </w:r>
-      <w:proofErr w:type="gramStart"/>
-      <w:r>
-        <w:t>date}}.</w:t>
-      </w:r>
-      <w:proofErr w:type="gramEnd"/>
-      <w:r>
-        <w:t xml:space="preserve"> The car contained {{comma_and_list(items)}}</w:t>
+        <w:t>about {{</w:t>
+      </w:r>
+      <w:proofErr w:type="spellStart"/>
+      <w:r>
+        <w:t>repo_</w:t>
+      </w:r>
+      <w:proofErr w:type="gramStart"/>
+      <w:r>
+        <w:t>date</w:t>
+      </w:r>
+      <w:proofErr w:type="spellEnd"/>
+      <w:r>
+        <w:t>}}.</w:t>
+      </w:r>
+      <w:proofErr w:type="gramEnd"/>
+      <w:r>
+        <w:t xml:space="preserve"> The car contained {{</w:t>
+      </w:r>
+      <w:proofErr w:type="spellStart"/>
+      <w:r>
+        <w:t>comma_and_list</w:t>
+      </w:r>
+      <w:proofErr w:type="spellEnd"/>
+      <w:r>
+        <w:t>(items)}}</w:t>
       </w:r>
       <w:r>
         <w:t>.</w:t>
@@ -620,14 +761,28 @@
         <w:rPr>
           <w:color w:val="000000"/>
         </w:rPr>
-        <w:t>].phone</w:t>
-      </w:r>
-      <w:proofErr w:type="gramEnd"/>
-      <w:r>
-        <w:rPr>
-          <w:color w:val="000000"/>
-        </w:rPr>
-        <w:t xml:space="preserve">_number == “” and </w:t>
+        <w:t>].</w:t>
+      </w:r>
+      <w:proofErr w:type="spellStart"/>
+      <w:r>
+        <w:rPr>
+          <w:color w:val="000000"/>
+        </w:rPr>
+        <w:t>phone</w:t>
+      </w:r>
+      <w:proofErr w:type="gramEnd"/>
+      <w:r>
+        <w:rPr>
+          <w:color w:val="000000"/>
+        </w:rPr>
+        <w:t>_number</w:t>
+      </w:r>
+      <w:proofErr w:type="spellEnd"/>
+      <w:r>
+        <w:rPr>
+          <w:color w:val="000000"/>
+        </w:rPr>
+        <w:t xml:space="preserve"> == “” and </w:t>
       </w:r>
       <w:proofErr w:type="gramStart"/>
       <w:r>
@@ -766,11 +921,19 @@
         </w:rPr>
       </w:pPr>
       <w:r>
-        <w:t>{{users[0].name_</w:t>
-      </w:r>
-      <w:proofErr w:type="gramStart"/>
-      <w:r>
-        <w:t>full(</w:t>
+        <w:t>{{users[0].</w:t>
+      </w:r>
+      <w:proofErr w:type="spellStart"/>
+      <w:r>
+        <w:t>name_</w:t>
+      </w:r>
+      <w:proofErr w:type="gramStart"/>
+      <w:r>
+        <w:t>full</w:t>
+      </w:r>
+      <w:proofErr w:type="spellEnd"/>
+      <w:r>
+        <w:t>(</w:t>
       </w:r>
       <w:proofErr w:type="gramEnd"/>
       <w:r>
@@ -794,7 +957,11 @@
       </w:r>
       <w:proofErr w:type="gramStart"/>
       <w:r>
-        <w:t>].phone</w:t>
+        <w:t>].</w:t>
+      </w:r>
+      <w:proofErr w:type="spellStart"/>
+      <w:r>
+        <w:t>phone</w:t>
       </w:r>
       <w:proofErr w:type="gramEnd"/>
       <w:r>
@@ -802,7 +969,11 @@
       </w:r>
       <w:proofErr w:type="gramStart"/>
       <w:r>
-        <w:t>number !</w:t>
+        <w:t>number</w:t>
+      </w:r>
+      <w:proofErr w:type="spellEnd"/>
+      <w:r>
+        <w:t xml:space="preserve"> !</w:t>
       </w:r>
       <w:proofErr w:type="gramEnd"/>
       <w:r>
@@ -819,21 +990,49 @@
         <w:rPr>
           <w:color w:val="000000"/>
         </w:rPr>
-        <w:t>{{phone_number_formatted(users[0</w:t>
-      </w:r>
-      <w:proofErr w:type="gramStart"/>
-      <w:r>
-        <w:rPr>
-          <w:color w:val="000000"/>
-        </w:rPr>
-        <w:t>].phone</w:t>
-      </w:r>
-      <w:proofErr w:type="gramEnd"/>
-      <w:r>
-        <w:rPr>
-          <w:color w:val="000000"/>
-        </w:rPr>
-        <w:t>_number)</w:t>
+        <w:t>{{</w:t>
+      </w:r>
+      <w:proofErr w:type="spellStart"/>
+      <w:r>
+        <w:rPr>
+          <w:color w:val="000000"/>
+        </w:rPr>
+        <w:t>phone_number_formatted</w:t>
+      </w:r>
+      <w:proofErr w:type="spellEnd"/>
+      <w:r>
+        <w:rPr>
+          <w:color w:val="000000"/>
+        </w:rPr>
+        <w:t>(users[0</w:t>
+      </w:r>
+      <w:proofErr w:type="gramStart"/>
+      <w:r>
+        <w:rPr>
+          <w:color w:val="000000"/>
+        </w:rPr>
+        <w:t>].</w:t>
+      </w:r>
+      <w:proofErr w:type="spellStart"/>
+      <w:r>
+        <w:rPr>
+          <w:color w:val="000000"/>
+        </w:rPr>
+        <w:t>phone</w:t>
+      </w:r>
+      <w:proofErr w:type="gramEnd"/>
+      <w:r>
+        <w:rPr>
+          <w:color w:val="000000"/>
+        </w:rPr>
+        <w:t>_number</w:t>
+      </w:r>
+      <w:proofErr w:type="spellEnd"/>
+      <w:r>
+        <w:rPr>
+          <w:color w:val="000000"/>
+        </w:rPr>
+        <w:t>)</w:t>
       </w:r>
       <w:proofErr w:type="gramStart"/>
       <w:r>

</xml_diff>

<commit_message>
Implemented Mar 4 2026 feedback
</commit_message>
<xml_diff>
--- a/docassemble/ReturnCarProperty/data/templates/request_property_car_fin_letter.docx
+++ b/docassemble/ReturnCarProperty/data/templates/request_property_car_fin_letter.docx
@@ -402,6 +402,7 @@
     <w:p>
       <w:pPr>
         <w:pStyle w:val="NormalWeb"/>
+        <w:spacing w:after="0" w:afterAutospacing="0"/>
       </w:pPr>
       <w:r>
         <w:t>{{</w:t>
@@ -468,6 +469,7 @@
     <w:p>
       <w:pPr>
         <w:pStyle w:val="NormalWeb"/>
+        <w:spacing w:after="0" w:afterAutospacing="0"/>
       </w:pPr>
       <w:r>
         <w:t xml:space="preserve">Re: </w:t>
@@ -487,6 +489,7 @@
       <w:r>
         <w:t xml:space="preserve">ompany </w:t>
       </w:r>
+      <w:proofErr w:type="gramStart"/>
       <w:r>
         <w:t>i</w:t>
       </w:r>
@@ -494,16 +497,11 @@
         <w:t>nformation</w:t>
       </w:r>
       <w:r>
-        <w:t>.</w:t>
-      </w:r>
-      <w:r>
-        <w:t xml:space="preserve"> </w:t>
-      </w:r>
-      <w:r>
-        <w:br/>
-      </w:r>
-      <w:r>
-        <w:t xml:space="preserve">{% if </w:t>
+        <w:t>{</w:t>
+      </w:r>
+      <w:proofErr w:type="gramEnd"/>
+      <w:r>
+        <w:t xml:space="preserve">% if </w:t>
       </w:r>
       <w:proofErr w:type="spellStart"/>
       <w:r>
@@ -515,22 +513,27 @@
       </w:r>
       <w:proofErr w:type="gramEnd"/>
       <w:r>
-        <w:t>_number</w:t>
+        <w:t>_</w:t>
+      </w:r>
+      <w:proofErr w:type="gramStart"/>
+      <w:r>
+        <w:t>number</w:t>
       </w:r>
       <w:proofErr w:type="spellEnd"/>
       <w:r>
-        <w:t xml:space="preserve"> != “” %}</w:t>
-      </w:r>
-      <w:r>
-        <w:t xml:space="preserve">     </w:t>
-      </w:r>
-      <w:r>
-        <w:rPr>
-          <w:sz w:val="18"/>
-          <w:szCs w:val="18"/>
-        </w:rPr>
-        <w:t xml:space="preserve"> </w:t>
-      </w:r>
+        <w:t xml:space="preserve"> !</w:t>
+      </w:r>
+      <w:proofErr w:type="gramEnd"/>
+      <w:r>
+        <w:t>= “” %}</w:t>
+      </w:r>
+    </w:p>
+    <w:p>
+      <w:pPr>
+        <w:pStyle w:val="NormalWeb"/>
+        <w:spacing w:before="0" w:beforeAutospacing="0"/>
+        <w:ind w:left="360"/>
+      </w:pPr>
       <w:r>
         <w:rPr>
           <w:sz w:val="12"/>
@@ -543,12 +546,30 @@
       </w:r>
       <w:proofErr w:type="spellStart"/>
       <w:r>
-        <w:t>fin_company.account_number</w:t>
+        <w:t>fin_</w:t>
+      </w:r>
+      <w:proofErr w:type="gramStart"/>
+      <w:r>
+        <w:t>company.account</w:t>
+      </w:r>
+      <w:proofErr w:type="gramEnd"/>
+      <w:r>
+        <w:t>_number</w:t>
       </w:r>
       <w:proofErr w:type="spellEnd"/>
-      <w:r>
-        <w:t>}}{% endif %}</w:t>
-      </w:r>
+      <w:proofErr w:type="gramStart"/>
+      <w:r>
+        <w:t>}}{</w:t>
+      </w:r>
+      <w:proofErr w:type="gramEnd"/>
+      <w:r>
+        <w:t xml:space="preserve">% </w:t>
+      </w:r>
+      <w:proofErr w:type="gramStart"/>
+      <w:r>
+        <w:t>endif %}</w:t>
+      </w:r>
+      <w:proofErr w:type="gramEnd"/>
     </w:p>
     <w:p>
       <w:pPr>
@@ -1100,6 +1121,127 @@
     </w:sectPr>
   </w:body>
 </w:document>
+</file>
+
+<file path=word/numbering.xml><?xml version="1.0" encoding="utf-8"?>
+<w:numbering xmlns:wpc="http://schemas.microsoft.com/office/word/2010/wordprocessingCanvas" xmlns:cx="http://schemas.microsoft.com/office/drawing/2014/chartex" xmlns:cx1="http://schemas.microsoft.com/office/drawing/2015/9/8/chartex" xmlns:cx2="http://schemas.microsoft.com/office/drawing/2015/10/21/chartex" xmlns:cx3="http://schemas.microsoft.com/office/drawing/2016/5/9/chartex" xmlns:cx4="http://schemas.microsoft.com/office/drawing/2016/5/10/chartex" xmlns:cx5="http://schemas.microsoft.com/office/drawing/2016/5/11/chartex" xmlns:cx6="http://schemas.microsoft.com/office/drawing/2016/5/12/chartex" xmlns:cx7="http://schemas.microsoft.com/office/drawing/2016/5/13/chartex" xmlns:cx8="http://schemas.microsoft.com/office/drawing/2016/5/14/chartex" xmlns:mc="http://schemas.openxmlformats.org/markup-compatibility/2006" xmlns:aink="http://schemas.microsoft.com/office/drawing/2016/ink" xmlns:am3d="http://schemas.microsoft.com/office/drawing/2017/model3d" xmlns:o="urn:schemas-microsoft-com:office:office" xmlns:oel="http://schemas.microsoft.com/office/2019/extlst" xmlns:r="http://schemas.openxmlformats.org/officeDocument/2006/relationships" xmlns:m="http://schemas.openxmlformats.org/officeDocument/2006/math" xmlns:v="urn:schemas-microsoft-com:vml" xmlns:wp14="http://schemas.microsoft.com/office/word/2010/wordprocessingDrawing" xmlns:wp="http://schemas.openxmlformats.org/drawingml/2006/wordprocessingDrawing" xmlns:w10="urn:schemas-microsoft-com:office:word" xmlns:w="http://schemas.openxmlformats.org/wordprocessingml/2006/main" xmlns:w14="http://schemas.microsoft.com/office/word/2010/wordml" xmlns:w15="http://schemas.microsoft.com/office/word/2012/wordml" xmlns:w16cex="http://schemas.microsoft.com/office/word/2018/wordml/cex" xmlns:w16cid="http://schemas.microsoft.com/office/word/2016/wordml/cid" xmlns:w16="http://schemas.microsoft.com/office/word/2018/wordml" xmlns:w16du="http://schemas.microsoft.com/office/word/2023/wordml/word16du" xmlns:w16sdtdh="http://schemas.microsoft.com/office/word/2020/wordml/sdtdatahash" xmlns:w16sdtfl="http://schemas.microsoft.com/office/word/2024/wordml/sdtformatlock" xmlns:w16se="http://schemas.microsoft.com/office/word/2015/wordml/symex" xmlns:wpg="http://schemas.microsoft.com/office/word/2010/wordprocessingGroup" xmlns:wpi="http://schemas.microsoft.com/office/word/2010/wordprocessingInk" xmlns:wne="http://schemas.microsoft.com/office/word/2006/wordml" xmlns:wps="http://schemas.microsoft.com/office/word/2010/wordprocessingShape" mc:Ignorable="w14 w15 w16se w16cid w16 w16cex w16sdtdh w16sdtfl w16du wp14">
+  <w:abstractNum w:abstractNumId="0" w15:restartNumberingAfterBreak="0">
+    <w:nsid w:val="0AB325A0"/>
+    <w:multiLevelType w:val="hybridMultilevel"/>
+    <w:tmpl w:val="5D0AA1D4"/>
+    <w:lvl w:ilvl="0" w:tplc="04090001">
+      <w:start w:val="1"/>
+      <w:numFmt w:val="bullet"/>
+      <w:lvlText w:val=""/>
+      <w:lvlJc w:val="left"/>
+      <w:pPr>
+        <w:ind w:left="720" w:hanging="360"/>
+      </w:pPr>
+      <w:rPr>
+        <w:rFonts w:ascii="Symbol" w:hAnsi="Symbol" w:hint="default"/>
+      </w:rPr>
+    </w:lvl>
+    <w:lvl w:ilvl="1" w:tplc="04090003" w:tentative="1">
+      <w:start w:val="1"/>
+      <w:numFmt w:val="bullet"/>
+      <w:lvlText w:val="o"/>
+      <w:lvlJc w:val="left"/>
+      <w:pPr>
+        <w:ind w:left="1440" w:hanging="360"/>
+      </w:pPr>
+      <w:rPr>
+        <w:rFonts w:ascii="Courier New" w:hAnsi="Courier New" w:cs="Courier New" w:hint="default"/>
+      </w:rPr>
+    </w:lvl>
+    <w:lvl w:ilvl="2" w:tplc="04090005" w:tentative="1">
+      <w:start w:val="1"/>
+      <w:numFmt w:val="bullet"/>
+      <w:lvlText w:val=""/>
+      <w:lvlJc w:val="left"/>
+      <w:pPr>
+        <w:ind w:left="2160" w:hanging="360"/>
+      </w:pPr>
+      <w:rPr>
+        <w:rFonts w:ascii="Wingdings" w:hAnsi="Wingdings" w:hint="default"/>
+      </w:rPr>
+    </w:lvl>
+    <w:lvl w:ilvl="3" w:tplc="04090001" w:tentative="1">
+      <w:start w:val="1"/>
+      <w:numFmt w:val="bullet"/>
+      <w:lvlText w:val=""/>
+      <w:lvlJc w:val="left"/>
+      <w:pPr>
+        <w:ind w:left="2880" w:hanging="360"/>
+      </w:pPr>
+      <w:rPr>
+        <w:rFonts w:ascii="Symbol" w:hAnsi="Symbol" w:hint="default"/>
+      </w:rPr>
+    </w:lvl>
+    <w:lvl w:ilvl="4" w:tplc="04090003" w:tentative="1">
+      <w:start w:val="1"/>
+      <w:numFmt w:val="bullet"/>
+      <w:lvlText w:val="o"/>
+      <w:lvlJc w:val="left"/>
+      <w:pPr>
+        <w:ind w:left="3600" w:hanging="360"/>
+      </w:pPr>
+      <w:rPr>
+        <w:rFonts w:ascii="Courier New" w:hAnsi="Courier New" w:cs="Courier New" w:hint="default"/>
+      </w:rPr>
+    </w:lvl>
+    <w:lvl w:ilvl="5" w:tplc="04090005" w:tentative="1">
+      <w:start w:val="1"/>
+      <w:numFmt w:val="bullet"/>
+      <w:lvlText w:val=""/>
+      <w:lvlJc w:val="left"/>
+      <w:pPr>
+        <w:ind w:left="4320" w:hanging="360"/>
+      </w:pPr>
+      <w:rPr>
+        <w:rFonts w:ascii="Wingdings" w:hAnsi="Wingdings" w:hint="default"/>
+      </w:rPr>
+    </w:lvl>
+    <w:lvl w:ilvl="6" w:tplc="04090001" w:tentative="1">
+      <w:start w:val="1"/>
+      <w:numFmt w:val="bullet"/>
+      <w:lvlText w:val=""/>
+      <w:lvlJc w:val="left"/>
+      <w:pPr>
+        <w:ind w:left="5040" w:hanging="360"/>
+      </w:pPr>
+      <w:rPr>
+        <w:rFonts w:ascii="Symbol" w:hAnsi="Symbol" w:hint="default"/>
+      </w:rPr>
+    </w:lvl>
+    <w:lvl w:ilvl="7" w:tplc="04090003" w:tentative="1">
+      <w:start w:val="1"/>
+      <w:numFmt w:val="bullet"/>
+      <w:lvlText w:val="o"/>
+      <w:lvlJc w:val="left"/>
+      <w:pPr>
+        <w:ind w:left="5760" w:hanging="360"/>
+      </w:pPr>
+      <w:rPr>
+        <w:rFonts w:ascii="Courier New" w:hAnsi="Courier New" w:cs="Courier New" w:hint="default"/>
+      </w:rPr>
+    </w:lvl>
+    <w:lvl w:ilvl="8" w:tplc="04090005" w:tentative="1">
+      <w:start w:val="1"/>
+      <w:numFmt w:val="bullet"/>
+      <w:lvlText w:val=""/>
+      <w:lvlJc w:val="left"/>
+      <w:pPr>
+        <w:ind w:left="6480" w:hanging="360"/>
+      </w:pPr>
+      <w:rPr>
+        <w:rFonts w:ascii="Wingdings" w:hAnsi="Wingdings" w:hint="default"/>
+      </w:rPr>
+    </w:lvl>
+  </w:abstractNum>
+  <w:num w:numId="1" w16cid:durableId="819927268">
+    <w:abstractNumId w:val="0"/>
+  </w:num>
+</w:numbering>
 </file>
 
 <file path=word/styles.xml><?xml version="1.0" encoding="utf-8"?>

</xml_diff>

<commit_message>
Implemented May 20 2026 feedback
</commit_message>
<xml_diff>
--- a/docassemble/ReturnCarProperty/data/templates/request_property_car_fin_letter.docx
+++ b/docassemble/ReturnCarProperty/data/templates/request_property_car_fin_letter.docx
@@ -68,23 +68,7 @@
                 <w:sz w:val="24"/>
                 <w:szCs w:val="24"/>
               </w:rPr>
-              <w:t>{{</w:t>
-            </w:r>
-            <w:proofErr w:type="spellStart"/>
-            <w:r>
-              <w:rPr>
-                <w:sz w:val="24"/>
-                <w:szCs w:val="24"/>
-              </w:rPr>
-              <w:t>letter_date</w:t>
-            </w:r>
-            <w:proofErr w:type="spellEnd"/>
-            <w:r>
-              <w:rPr>
-                <w:sz w:val="24"/>
-                <w:szCs w:val="24"/>
-              </w:rPr>
-              <w:t>}}</w:t>
+              <w:t>{{letter_date}}</w:t>
             </w:r>
             <w:r>
               <w:rPr>
@@ -99,23 +83,7 @@
                 <w:szCs w:val="24"/>
               </w:rPr>
               <w:br/>
-              <w:t>{{users[0].</w:t>
-            </w:r>
-            <w:proofErr w:type="spellStart"/>
-            <w:r>
-              <w:rPr>
-                <w:sz w:val="24"/>
-                <w:szCs w:val="24"/>
-              </w:rPr>
-              <w:t>name_full</w:t>
-            </w:r>
-            <w:proofErr w:type="spellEnd"/>
-            <w:r>
-              <w:rPr>
-                <w:sz w:val="24"/>
-                <w:szCs w:val="24"/>
-              </w:rPr>
-              <w:t>()}}</w:t>
+              <w:t>{{users[0].name_full()}}</w:t>
             </w:r>
             <w:r>
               <w:rPr>
@@ -129,23 +97,7 @@
                 <w:sz w:val="24"/>
                 <w:szCs w:val="24"/>
               </w:rPr>
-              <w:t xml:space="preserve">{% if </w:t>
-            </w:r>
-            <w:proofErr w:type="spellStart"/>
-            <w:r>
-              <w:rPr>
-                <w:sz w:val="24"/>
-                <w:szCs w:val="24"/>
-              </w:rPr>
-              <w:t>fin_company.account_number</w:t>
-            </w:r>
-            <w:proofErr w:type="spellEnd"/>
-            <w:r>
-              <w:rPr>
-                <w:sz w:val="24"/>
-                <w:szCs w:val="24"/>
-              </w:rPr>
-              <w:t xml:space="preserve"> != “” %}</w:t>
+              <w:t>{% if fin_company.account_number != “” %}</w:t>
             </w:r>
             <w:r>
               <w:rPr>
@@ -154,7 +106,6 @@
               </w:rPr>
               <w:t>Account number: {{</w:t>
             </w:r>
-            <w:proofErr w:type="spellStart"/>
             <w:r>
               <w:rPr>
                 <w:sz w:val="24"/>
@@ -167,15 +118,7 @@
                 <w:sz w:val="24"/>
                 <w:szCs w:val="24"/>
               </w:rPr>
-              <w:t>account_number</w:t>
-            </w:r>
-            <w:proofErr w:type="spellEnd"/>
-            <w:r>
-              <w:rPr>
-                <w:sz w:val="24"/>
-                <w:szCs w:val="24"/>
-              </w:rPr>
-              <w:t>}}</w:t>
+              <w:t>account_number}}</w:t>
             </w:r>
             <w:r>
               <w:rPr>
@@ -203,23 +146,7 @@
                 <w:sz w:val="24"/>
                 <w:szCs w:val="24"/>
               </w:rPr>
-              <w:t>[0].</w:t>
-            </w:r>
-            <w:proofErr w:type="spellStart"/>
-            <w:r>
-              <w:rPr>
-                <w:sz w:val="24"/>
-                <w:szCs w:val="24"/>
-              </w:rPr>
-              <w:t>address.line_one</w:t>
-            </w:r>
-            <w:proofErr w:type="spellEnd"/>
-            <w:r>
-              <w:rPr>
-                <w:sz w:val="24"/>
-                <w:szCs w:val="24"/>
-              </w:rPr>
-              <w:t>(bare=True)}}</w:t>
+              <w:t>[0].address.line_one(bare=True)}}</w:t>
             </w:r>
             <w:r>
               <w:rPr>
@@ -233,23 +160,7 @@
                 <w:sz w:val="24"/>
                 <w:szCs w:val="24"/>
               </w:rPr>
-              <w:t>{{users[0].</w:t>
-            </w:r>
-            <w:proofErr w:type="spellStart"/>
-            <w:r>
-              <w:rPr>
-                <w:sz w:val="24"/>
-                <w:szCs w:val="24"/>
-              </w:rPr>
-              <w:t>address.line_two</w:t>
-            </w:r>
-            <w:proofErr w:type="spellEnd"/>
-            <w:r>
-              <w:rPr>
-                <w:sz w:val="24"/>
-                <w:szCs w:val="24"/>
-              </w:rPr>
-              <w:t>()}}</w:t>
+              <w:t>{{users[0].address.line_two()}}</w:t>
             </w:r>
           </w:p>
         </w:tc>
@@ -261,39 +172,15 @@
         <w:spacing w:after="0" w:afterAutospacing="0"/>
       </w:pPr>
       <w:r>
-        <w:t>{{</w:t>
-      </w:r>
-      <w:proofErr w:type="spellStart"/>
-      <w:r>
-        <w:t>fin_company.name.first</w:t>
-      </w:r>
-      <w:proofErr w:type="spellEnd"/>
-      <w:r>
-        <w:t>}}</w:t>
+        <w:t>{{fin_company.name.first}}</w:t>
       </w:r>
       <w:r>
         <w:br/>
-        <w:t>{{</w:t>
-      </w:r>
-      <w:proofErr w:type="spellStart"/>
-      <w:r>
-        <w:t>fin_company.address.line_one</w:t>
-      </w:r>
-      <w:proofErr w:type="spellEnd"/>
-      <w:r>
-        <w:t>(bare=True)}}</w:t>
+        <w:t>{{fin_company.address.line_one(bare=True)}}</w:t>
       </w:r>
       <w:r>
         <w:br/>
-        <w:t>{{</w:t>
-      </w:r>
-      <w:proofErr w:type="spellStart"/>
-      <w:r>
-        <w:t>fin_company.address.line_two</w:t>
-      </w:r>
-      <w:proofErr w:type="spellEnd"/>
-      <w:r>
-        <w:t>()}}</w:t>
+        <w:t>{{fin_company.address.line_two()}}</w:t>
       </w:r>
     </w:p>
     <w:p>
@@ -326,15 +213,7 @@
         <w:t>nformation</w:t>
       </w:r>
       <w:r>
-        <w:t xml:space="preserve">{% if </w:t>
-      </w:r>
-      <w:proofErr w:type="spellStart"/>
-      <w:r>
-        <w:t>fin_company.account_number</w:t>
-      </w:r>
-      <w:proofErr w:type="spellEnd"/>
-      <w:r>
-        <w:t xml:space="preserve"> != “” %}</w:t>
+        <w:t>{% if fin_company.account_number != “” %}</w:t>
       </w:r>
     </w:p>
     <w:p>
@@ -351,15 +230,7 @@
         <w:t xml:space="preserve"> </w:t>
       </w:r>
       <w:r>
-        <w:t>Account #: {{</w:t>
-      </w:r>
-      <w:proofErr w:type="spellStart"/>
-      <w:r>
-        <w:t>fin_company.account_number</w:t>
-      </w:r>
-      <w:proofErr w:type="spellEnd"/>
-      <w:r>
-        <w:t>}}{% endif %}</w:t>
+        <w:t>Account #: {{fin_company.account_number}}{% endif %}</w:t>
       </w:r>
     </w:p>
     <w:p>
@@ -367,15 +238,7 @@
         <w:pStyle w:val="NormalWeb"/>
       </w:pPr>
       <w:r>
-        <w:t>Dear {{</w:t>
-      </w:r>
-      <w:proofErr w:type="spellStart"/>
-      <w:r>
-        <w:t>fin_company.name.first</w:t>
-      </w:r>
-      <w:proofErr w:type="spellEnd"/>
-      <w:r>
-        <w:t>}}:</w:t>
+        <w:t>Dear {{fin_company.name.first}}:</w:t>
       </w:r>
     </w:p>
     <w:p>
@@ -395,31 +258,13 @@
         <w:t xml:space="preserve">, </w:t>
       </w:r>
       <w:r>
-        <w:t>a {{</w:t>
-      </w:r>
-      <w:proofErr w:type="spellStart"/>
-      <w:r>
-        <w:t>car_year</w:t>
-      </w:r>
-      <w:proofErr w:type="spellEnd"/>
-      <w:r>
-        <w:t>}} {{</w:t>
-      </w:r>
-      <w:proofErr w:type="spellStart"/>
-      <w:r>
-        <w:t>car_make</w:t>
-      </w:r>
-      <w:proofErr w:type="spellEnd"/>
-      <w:r>
-        <w:t>}} {{</w:t>
-      </w:r>
-      <w:proofErr w:type="spellStart"/>
-      <w:r>
-        <w:t>car_model</w:t>
-      </w:r>
-      <w:proofErr w:type="spellEnd"/>
-      <w:r>
-        <w:t>}}.</w:t>
+        <w:t>a {{car_year}} {{car_make}} {{car_model}}</w:t>
+      </w:r>
+      <w:r>
+        <w:t>{% if vin_number != “” %} with the VIN number {{vin_number}}{% endif %}</w:t>
+      </w:r>
+      <w:r>
+        <w:t>.</w:t>
       </w:r>
       <w:r>
         <w:t xml:space="preserve"> </w:t>
@@ -428,29 +273,13 @@
         <w:t xml:space="preserve">It was repossessed on or </w:t>
       </w:r>
       <w:r>
-        <w:t>about {{</w:t>
-      </w:r>
-      <w:proofErr w:type="spellStart"/>
-      <w:r>
-        <w:t>repo_date</w:t>
-      </w:r>
-      <w:proofErr w:type="spellEnd"/>
-      <w:r>
-        <w:t xml:space="preserve">}}. The car contained </w:t>
+        <w:t xml:space="preserve">about {{repo_date}}. The car contained </w:t>
       </w:r>
       <w:r>
         <w:t xml:space="preserve">my </w:t>
       </w:r>
       <w:r>
-        <w:t>{{</w:t>
-      </w:r>
-      <w:proofErr w:type="spellStart"/>
-      <w:r>
-        <w:t>comma_and_list</w:t>
-      </w:r>
-      <w:proofErr w:type="spellEnd"/>
-      <w:r>
-        <w:t>(items)}}</w:t>
+        <w:t>{{comma_and_list(items)}}</w:t>
       </w:r>
       <w:r>
         <w:t>.</w:t>
@@ -465,7 +294,13 @@
         <w:t xml:space="preserve">. </w:t>
       </w:r>
       <w:r>
-        <w:t>Under the Illinois Collateral Recovery Act (225 ILCS 422/1), I am entitled to a detailed inventory of all property that was in the car</w:t>
+        <w:t>Under the Illinois Collateral Recovery Act (225 ILCS 422/1</w:t>
+      </w:r>
+      <w:r>
+        <w:t>10(c)</w:t>
+      </w:r>
+      <w:r>
+        <w:t>), I am entitled to a detailed inventory of all property that was in the car</w:t>
       </w:r>
       <w:r>
         <w:t xml:space="preserve"> from the repossession company</w:t>
@@ -548,21 +383,7 @@
         <w:rPr>
           <w:color w:val="000000"/>
         </w:rPr>
-        <w:t>{% if users[0].</w:t>
-      </w:r>
-      <w:proofErr w:type="spellStart"/>
-      <w:r>
-        <w:rPr>
-          <w:color w:val="000000"/>
-        </w:rPr>
-        <w:t>phone_number</w:t>
-      </w:r>
-      <w:proofErr w:type="spellEnd"/>
-      <w:r>
-        <w:rPr>
-          <w:color w:val="000000"/>
-        </w:rPr>
-        <w:t xml:space="preserve"> == “” and users[0].email == “” %}</w:t>
+        <w:t>{% if users[0].phone_number == “” and users[0].email == “” %}</w:t>
       </w:r>
       <w:r>
         <w:rPr>
@@ -617,23 +438,7 @@
         </w:rPr>
       </w:pPr>
       <w:r>
-        <w:t>{{users[0].</w:t>
-      </w:r>
-      <w:proofErr w:type="spellStart"/>
-      <w:r>
-        <w:t>name_full</w:t>
-      </w:r>
-      <w:proofErr w:type="spellEnd"/>
-      <w:r>
-        <w:t>()}}{% if users[0].</w:t>
-      </w:r>
-      <w:proofErr w:type="spellStart"/>
-      <w:r>
-        <w:t>phone_number</w:t>
-      </w:r>
-      <w:proofErr w:type="spellEnd"/>
-      <w:r>
-        <w:t xml:space="preserve"> != “” %}</w:t>
+        <w:t>{{users[0].name_full()}}{% if users[0].phone_number != “” %}</w:t>
       </w:r>
       <w:r>
         <w:rPr>
@@ -646,35 +451,7 @@
         <w:rPr>
           <w:color w:val="000000"/>
         </w:rPr>
-        <w:t>{{</w:t>
-      </w:r>
-      <w:proofErr w:type="spellStart"/>
-      <w:r>
-        <w:rPr>
-          <w:color w:val="000000"/>
-        </w:rPr>
-        <w:t>phone_number_formatted</w:t>
-      </w:r>
-      <w:proofErr w:type="spellEnd"/>
-      <w:r>
-        <w:rPr>
-          <w:color w:val="000000"/>
-        </w:rPr>
-        <w:t>(users[0].</w:t>
-      </w:r>
-      <w:proofErr w:type="spellStart"/>
-      <w:r>
-        <w:rPr>
-          <w:color w:val="000000"/>
-        </w:rPr>
-        <w:t>phone_number</w:t>
-      </w:r>
-      <w:proofErr w:type="spellEnd"/>
-      <w:r>
-        <w:rPr>
-          <w:color w:val="000000"/>
-        </w:rPr>
-        <w:t>)}}</w:t>
+        <w:t>{{phone_number_formatted(users[0].phone_number)}}</w:t>
       </w:r>
       <w:r>
         <w:t>{% endif %}{% if users[0].email != “” %}</w:t>

</xml_diff>

<commit_message>
Implemented June 1 2026 feedback
</commit_message>
<xml_diff>
--- a/docassemble/ReturnCarProperty/data/templates/request_property_car_fin_letter.docx
+++ b/docassemble/ReturnCarProperty/data/templates/request_property_car_fin_letter.docx
@@ -10,6 +10,13 @@
           <w:bCs/>
         </w:rPr>
       </w:pPr>
+      <w:r>
+        <w:rPr>
+          <w:b/>
+          <w:bCs/>
+        </w:rPr>
+        <w:t xml:space="preserve">SENT BY </w:t>
+      </w:r>
       <w:r>
         <w:rPr>
           <w:b/>

</xml_diff>